<commit_message>
docs(solimed): add team recognition section to CTO draft gap analysis
Added Section 0 as highest priority addition to the CTO draft — a
dedicated acknowledgment of what Ivan and his team built on a constrained
budget before any risk or gap discussion. Includes specific metrics
(321 patients, €2.1M backlog, 15+ CROs) and reframes the engagement
from 'here is what is wrong' to 'here is how we scale what you built.'
</commit_message>
<xml_diff>
--- a/docs/reports/solimed-cto-draft-gap-analysis.docx
+++ b/docs/reports/solimed-cto-draft-gap-analysis.docx
@@ -2,7 +2,7 @@
 <file path=word/document.xml><?xml version="1.0" encoding="utf-8"?>
 <w:document xmlns:w="http://schemas.openxmlformats.org/wordprocessingml/2006/main" xmlns:m="http://schemas.openxmlformats.org/officeDocument/2006/math" xmlns:r="http://schemas.openxmlformats.org/officeDocument/2006/relationships" xmlns:o="urn:schemas-microsoft-com:office:office" xmlns:v="urn:schemas-microsoft-com:vml" xmlns:w10="urn:schemas-microsoft-com:office:word" xmlns:a="http://schemas.openxmlformats.org/drawingml/2006/main" xmlns:pic="http://schemas.openxmlformats.org/drawingml/2006/picture" xmlns:wp="http://schemas.openxmlformats.org/drawingml/2006/wordprocessingDrawing">
   <w:body>
-    <w:bookmarkStart w:id="31" w:name="X24b8fa0d2ed4e87760b46d1d6f28779ef27710b"/>
+    <w:bookmarkStart w:id="33" w:name="X24b8fa0d2ed4e87760b46d1d6f28779ef27710b"/>
     <w:p>
       <w:pPr>
         <w:pStyle w:val="Heading1"/>
@@ -180,13 +180,66 @@
       </w:r>
     </w:p>
     <w:bookmarkEnd w:id="9"/>
-    <w:bookmarkStart w:id="15" w:name="X2e7e23ebd7833173cae8b18bf4f32af4f9bad25"/>
+    <w:bookmarkStart w:id="11" w:name="X62bcd4742b512849e8a1557a3e0992c008bf628"/>
     <w:p>
       <w:pPr>
         <w:pStyle w:val="Heading2"/>
       </w:pPr>
       <w:r>
-        <w:t xml:space="preserve">SECTION 1 — CORRECTIONS (Draft is factually wrong — must change)</w:t>
+        <w:t xml:space="preserve">SECTION 0 — ADDITION: Recognition of What Solimed Has Built (Add Before Section 1)</w:t>
+      </w:r>
+    </w:p>
+    <w:p>
+      <w:pPr>
+        <w:pStyle w:val="FirstParagraph"/>
+      </w:pPr>
+      <w:r>
+        <w:rPr>
+          <w:b/>
+          <w:bCs/>
+        </w:rPr>
+        <w:t xml:space="preserve">Priority: HIGH — Add this before anything else in the revised assessment.</w:t>
+      </w:r>
+    </w:p>
+    <w:p>
+      <w:pPr>
+        <w:pStyle w:val="BodyText"/>
+      </w:pPr>
+      <w:r>
+        <w:t xml:space="preserve">The current draft jumps straight into risk assessment without acknowledging what Ivan and his team have actually accomplished. This is a significant relationship mistake. Before identifying any gaps or recommending any changes, the revised CTO assessment must open by recognizing what was built, how it was built, and what it cost to get here.</w:t>
+      </w:r>
+    </w:p>
+    <w:p>
+      <w:pPr>
+        <w:pStyle w:val="BodyText"/>
+      </w:pPr>
+      <w:r>
+        <w:rPr>
+          <w:b/>
+          <w:bCs/>
+        </w:rPr>
+        <w:t xml:space="preserve">Proposed language — add as an opening section titled</w:t>
+      </w:r>
+      <w:r>
+        <w:rPr>
+          <w:b/>
+          <w:bCs/>
+        </w:rPr>
+        <w:t xml:space="preserve"> </w:t>
+      </w:r>
+      <w:r>
+        <w:rPr>
+          <w:b/>
+          <w:bCs/>
+        </w:rPr>
+        <w:t xml:space="preserve">“Acknowledgment of What Solimed Has Built”</w:t>
+      </w:r>
+      <w:r>
+        <w:rPr>
+          <w:b/>
+          <w:bCs/>
+        </w:rPr>
+        <w:t xml:space="preserve">:</w:t>
       </w:r>
     </w:p>
     <w:p>
@@ -196,7 +249,388 @@
         </w:pict>
       </w:r>
     </w:p>
-    <w:bookmarkStart w:id="10" w:name="Xdc49786f6a9ca100e7b3936bd77a90d95a77b4a"/>
+    <w:p>
+      <w:pPr>
+        <w:pStyle w:val="Heading3"/>
+      </w:pPr>
+      <w:bookmarkStart w:id="10" w:name="X8a3ff86d05bcd824a72738f1a67ca057c9fd1a7"/>
+      <w:r>
+        <w:t xml:space="preserve">What Solimed Has Built — and Why It Matters</w:t>
+      </w:r>
+      <w:bookmarkEnd w:id="10"/>
+    </w:p>
+    <w:p>
+      <w:pPr>
+        <w:pStyle w:val="BlockText"/>
+      </w:pPr>
+      <w:r>
+        <w:t xml:space="preserve">Before any technical assessment, this needs to be said plainly:</w:t>
+      </w:r>
+      <w:r>
+        <w:t xml:space="preserve"> </w:t>
+      </w:r>
+      <w:r>
+        <w:rPr>
+          <w:b/>
+          <w:bCs/>
+        </w:rPr>
+        <w:t xml:space="preserve">Ivan and his team have built something genuinely impressive on a constrained budget.</w:t>
+      </w:r>
+    </w:p>
+    <w:p>
+      <w:pPr>
+        <w:pStyle w:val="BlockText"/>
+      </w:pPr>
+      <w:r>
+        <w:t xml:space="preserve">Starting from Excel spreadsheets and evolving over three-plus years into a functioning operational platform, Solimed’s Study Tracking system now manages:</w:t>
+      </w:r>
+    </w:p>
+    <w:p>
+      <w:pPr>
+        <w:pStyle w:val="Compact"/>
+        <w:numPr>
+          <w:ilvl w:val="0"/>
+          <w:numId w:val="1001"/>
+        </w:numPr>
+      </w:pPr>
+      <w:r>
+        <w:rPr>
+          <w:b/>
+          <w:bCs/>
+        </w:rPr>
+        <w:t xml:space="preserve">321 active enrolled patients</w:t>
+      </w:r>
+      <w:r>
+        <w:t xml:space="preserve"> </w:t>
+      </w:r>
+      <w:r>
+        <w:t xml:space="preserve">across hundreds of clinical studies</w:t>
+      </w:r>
+    </w:p>
+    <w:p>
+      <w:pPr>
+        <w:pStyle w:val="Compact"/>
+        <w:numPr>
+          <w:ilvl w:val="0"/>
+          <w:numId w:val="1001"/>
+        </w:numPr>
+      </w:pPr>
+      <w:r>
+        <w:rPr>
+          <w:b/>
+          <w:bCs/>
+        </w:rPr>
+        <w:t xml:space="preserve">15+ CRO relationships</w:t>
+      </w:r>
+      <w:r>
+        <w:t xml:space="preserve"> </w:t>
+      </w:r>
+      <w:r>
+        <w:t xml:space="preserve">with complex, individually negotiated fee structures</w:t>
+      </w:r>
+    </w:p>
+    <w:p>
+      <w:pPr>
+        <w:pStyle w:val="Compact"/>
+        <w:numPr>
+          <w:ilvl w:val="0"/>
+          <w:numId w:val="1001"/>
+        </w:numPr>
+      </w:pPr>
+      <w:r>
+        <w:rPr>
+          <w:b/>
+          <w:bCs/>
+        </w:rPr>
+        <w:t xml:space="preserve">€2.1 million in tracked, structured financial backlog</w:t>
+      </w:r>
+      <w:r>
+        <w:t xml:space="preserve"> </w:t>
+      </w:r>
+      <w:r>
+        <w:t xml:space="preserve">across studies running through 2032</w:t>
+      </w:r>
+    </w:p>
+    <w:p>
+      <w:pPr>
+        <w:pStyle w:val="Compact"/>
+        <w:numPr>
+          <w:ilvl w:val="0"/>
+          <w:numId w:val="1001"/>
+        </w:numPr>
+      </w:pPr>
+      <w:r>
+        <w:rPr>
+          <w:b/>
+          <w:bCs/>
+        </w:rPr>
+        <w:t xml:space="preserve">Two clinical sites</w:t>
+      </w:r>
+      <w:r>
+        <w:t xml:space="preserve"> </w:t>
+      </w:r>
+      <w:r>
+        <w:t xml:space="preserve">(Solimed Clinic and Medico RI) with separate real-time financial reporting shared live with hospital management</w:t>
+      </w:r>
+    </w:p>
+    <w:p>
+      <w:pPr>
+        <w:pStyle w:val="Compact"/>
+        <w:numPr>
+          <w:ilvl w:val="0"/>
+          <w:numId w:val="1001"/>
+        </w:numPr>
+      </w:pPr>
+      <w:r>
+        <w:t xml:space="preserve">A</w:t>
+      </w:r>
+      <w:r>
+        <w:t xml:space="preserve"> </w:t>
+      </w:r>
+      <w:r>
+        <w:rPr>
+          <w:b/>
+          <w:bCs/>
+        </w:rPr>
+        <w:t xml:space="preserve">sophisticated investigator fee model</w:t>
+      </w:r>
+      <w:r>
+        <w:t xml:space="preserve"> </w:t>
+      </w:r>
+      <w:r>
+        <w:t xml:space="preserve">handling PI cuts, PI fees, sub-investigator splits, and referral doctor fees — all configurable per study</w:t>
+      </w:r>
+    </w:p>
+    <w:p>
+      <w:pPr>
+        <w:pStyle w:val="Compact"/>
+        <w:numPr>
+          <w:ilvl w:val="0"/>
+          <w:numId w:val="1001"/>
+        </w:numPr>
+      </w:pPr>
+      <w:r>
+        <w:t xml:space="preserve">A</w:t>
+      </w:r>
+      <w:r>
+        <w:t xml:space="preserve"> </w:t>
+      </w:r>
+      <w:r>
+        <w:rPr>
+          <w:b/>
+          <w:bCs/>
+        </w:rPr>
+        <w:t xml:space="preserve">protocol amendment system</w:t>
+      </w:r>
+      <w:r>
+        <w:t xml:space="preserve"> </w:t>
+      </w:r>
+      <w:r>
+        <w:t xml:space="preserve">that correctly recalculates historical visit fees when contracts change mid-study</w:t>
+      </w:r>
+    </w:p>
+    <w:p>
+      <w:pPr>
+        <w:pStyle w:val="Compact"/>
+        <w:numPr>
+          <w:ilvl w:val="0"/>
+          <w:numId w:val="1001"/>
+        </w:numPr>
+      </w:pPr>
+      <w:r>
+        <w:rPr>
+          <w:b/>
+          <w:bCs/>
+        </w:rPr>
+        <w:t xml:space="preserve">Auto-scheduling and auto-skip logic</w:t>
+      </w:r>
+      <w:r>
+        <w:t xml:space="preserve"> </w:t>
+      </w:r>
+      <w:r>
+        <w:t xml:space="preserve">that eliminates manual work the moment a patient hits randomization or screen failure</w:t>
+      </w:r>
+    </w:p>
+    <w:p>
+      <w:pPr>
+        <w:pStyle w:val="Compact"/>
+        <w:numPr>
+          <w:ilvl w:val="0"/>
+          <w:numId w:val="1001"/>
+        </w:numPr>
+      </w:pPr>
+      <w:r>
+        <w:rPr>
+          <w:b/>
+          <w:bCs/>
+        </w:rPr>
+        <w:t xml:space="preserve">Power BI financial dashboards</w:t>
+      </w:r>
+      <w:r>
+        <w:t xml:space="preserve"> </w:t>
+      </w:r>
+      <w:r>
+        <w:t xml:space="preserve">that give management, coordinators, and hospital partners real-time visibility into revenue, costs, margins, backlog, and investigator utilization</w:t>
+      </w:r>
+    </w:p>
+    <w:p>
+      <w:pPr>
+        <w:pStyle w:val="BlockText"/>
+      </w:pPr>
+      <w:r>
+        <w:t xml:space="preserve">This was not built with an enterprise budget, a large team, or a long runway. It was built by a small team with domain expertise, a pragmatic mindset, and a deliberate resistance to over-engineering. They chose</w:t>
+      </w:r>
+      <w:r>
+        <w:t xml:space="preserve"> </w:t>
+      </w:r>
+      <w:r>
+        <w:rPr>
+          <w:b/>
+          <w:bCs/>
+        </w:rPr>
+        <w:t xml:space="preserve">not</w:t>
+      </w:r>
+      <w:r>
+        <w:t xml:space="preserve"> </w:t>
+      </w:r>
+      <w:r>
+        <w:t xml:space="preserve">to buy bloated off-the-shelf CTMS software that would have cost more, fit less, and required more administration. They chose instead to build exactly what they needed, prove it in production, and evolve it incrementally.</w:t>
+      </w:r>
+    </w:p>
+    <w:p>
+      <w:pPr>
+        <w:pStyle w:val="BlockText"/>
+      </w:pPr>
+      <w:r>
+        <w:t xml:space="preserve">That choice has paid off. The platform is real. It is used daily. It handles real money. Investigators reconcile their payment specifications against it every month. Hospital management relies on it for financial planning. Coordinators run their entire patient visit workflow through it.</w:t>
+      </w:r>
+    </w:p>
+    <w:p>
+      <w:pPr>
+        <w:pStyle w:val="BlockText"/>
+      </w:pPr>
+      <w:r>
+        <w:rPr>
+          <w:b/>
+          <w:bCs/>
+        </w:rPr>
+        <w:t xml:space="preserve">The goal of this assessment is not to replace what they built — it is to scale it.</w:t>
+      </w:r>
+    </w:p>
+    <w:p>
+      <w:pPr>
+        <w:pStyle w:val="BlockText"/>
+      </w:pPr>
+      <w:r>
+        <w:t xml:space="preserve">The platform has reached the natural ceiling of its current architecture. The Power Apps foundation that enabled fast, low-cost delivery will constrain the next phase of growth: international expansion, third-party integrations, mobile access for field investigators, and enterprise-grade security. These are good problems to have. They are the problems of a system that worked.</w:t>
+      </w:r>
+    </w:p>
+    <w:p>
+      <w:pPr>
+        <w:pStyle w:val="BlockText"/>
+      </w:pPr>
+      <w:r>
+        <w:t xml:space="preserve">Every recommendation in this document is made with deep respect for what came before it.</w:t>
+      </w:r>
+    </w:p>
+    <w:p>
+      <w:r>
+        <w:pict>
+          <v:rect style="width:0;height:1.5pt" o:hralign="center" o:hrstd="t" o:hr="t"/>
+        </w:pict>
+      </w:r>
+    </w:p>
+    <w:p>
+      <w:pPr>
+        <w:pStyle w:val="FirstParagraph"/>
+      </w:pPr>
+      <w:r>
+        <w:rPr>
+          <w:b/>
+          <w:bCs/>
+        </w:rPr>
+        <w:t xml:space="preserve">Why this matters:</w:t>
+      </w:r>
+      <w:r>
+        <w:t xml:space="preserve"> </w:t>
+      </w:r>
+      <w:r>
+        <w:t xml:space="preserve">Ivan built this. He will read this assessment. If the first thing he reads is a risk table calling his system of record</w:t>
+      </w:r>
+      <w:r>
+        <w:t xml:space="preserve"> </w:t>
+      </w:r>
+      <w:r>
+        <w:t xml:space="preserve">“None”</w:t>
+      </w:r>
+      <w:r>
+        <w:t xml:space="preserve"> </w:t>
+      </w:r>
+      <w:r>
+        <w:t xml:space="preserve">and his data capture</w:t>
+      </w:r>
+      <w:r>
+        <w:t xml:space="preserve"> </w:t>
+      </w:r>
+      <w:r>
+        <w:t xml:space="preserve">“Manual / Paper,”</w:t>
+      </w:r>
+      <w:r>
+        <w:t xml:space="preserve"> </w:t>
+      </w:r>
+      <w:r>
+        <w:t xml:space="preserve">he will disengage before he finishes page one. The opening above reframes the entire conversation — from</w:t>
+      </w:r>
+      <w:r>
+        <w:t xml:space="preserve"> </w:t>
+      </w:r>
+      <w:r>
+        <w:t xml:space="preserve">“here is what is wrong with your system”</w:t>
+      </w:r>
+      <w:r>
+        <w:t xml:space="preserve"> </w:t>
+      </w:r>
+      <w:r>
+        <w:t xml:space="preserve">to</w:t>
+      </w:r>
+      <w:r>
+        <w:t xml:space="preserve"> </w:t>
+      </w:r>
+      <w:r>
+        <w:t xml:space="preserve">“here is how we scale what you built.”</w:t>
+      </w:r>
+      <w:r>
+        <w:t xml:space="preserve"> </w:t>
+      </w:r>
+      <w:r>
+        <w:t xml:space="preserve">That framing is the difference between a partnership and a vendor relationship.</w:t>
+      </w:r>
+    </w:p>
+    <w:p>
+      <w:r>
+        <w:pict>
+          <v:rect style="width:0;height:1.5pt" o:hralign="center" o:hrstd="t" o:hr="t"/>
+        </w:pict>
+      </w:r>
+    </w:p>
+    <w:bookmarkEnd w:id="11"/>
+    <w:bookmarkStart w:id="17" w:name="X2e7e23ebd7833173cae8b18bf4f32af4f9bad25"/>
+    <w:p>
+      <w:pPr>
+        <w:pStyle w:val="Heading2"/>
+      </w:pPr>
+      <w:r>
+        <w:t xml:space="preserve">SECTION 1 — CORRECTIONS (Draft is factually wrong — must change)</w:t>
+      </w:r>
+    </w:p>
+    <w:p>
+      <w:r>
+        <w:pict>
+          <v:rect style="width:0;height:1.5pt" o:hralign="center" o:hrstd="t" o:hr="t"/>
+        </w:pict>
+      </w:r>
+    </w:p>
+    <w:bookmarkStart w:id="12" w:name="Xdc49786f6a9ca100e7b3936bd77a90d95a77b4a"/>
     <w:p>
       <w:pPr>
         <w:pStyle w:val="Heading3"/>
@@ -863,8 +1297,8 @@
         </w:pict>
       </w:r>
     </w:p>
-    <w:bookmarkEnd w:id="10"/>
-    <w:bookmarkStart w:id="11" w:name="Xf1d4a7de7c6d3c0abfbfdd4fbd7fffad992e618"/>
+    <w:bookmarkEnd w:id="12"/>
+    <w:bookmarkStart w:id="13" w:name="Xf1d4a7de7c6d3c0abfbfdd4fbd7fffad992e618"/>
     <w:p>
       <w:pPr>
         <w:pStyle w:val="Heading3"/>
@@ -1005,8 +1439,8 @@
         </w:pict>
       </w:r>
     </w:p>
-    <w:bookmarkEnd w:id="11"/>
-    <w:bookmarkStart w:id="12" w:name="X8f4e26f3efff915329a4fc4bb8d03a43a97c0a5"/>
+    <w:bookmarkEnd w:id="13"/>
+    <w:bookmarkStart w:id="14" w:name="X8f4e26f3efff915329a4fc4bb8d03a43a97c0a5"/>
     <w:p>
       <w:pPr>
         <w:pStyle w:val="Heading3"/>
@@ -1157,8 +1591,8 @@
         </w:pict>
       </w:r>
     </w:p>
-    <w:bookmarkEnd w:id="12"/>
-    <w:bookmarkStart w:id="13" w:name="X9c16736289c79068b6e10976613581fd9a55591"/>
+    <w:bookmarkEnd w:id="14"/>
+    <w:bookmarkStart w:id="15" w:name="X9c16736289c79068b6e10976613581fd9a55591"/>
     <w:p>
       <w:pPr>
         <w:pStyle w:val="Heading3"/>
@@ -1290,8 +1724,8 @@
         </w:pict>
       </w:r>
     </w:p>
-    <w:bookmarkEnd w:id="13"/>
-    <w:bookmarkStart w:id="14" w:name="correction-5-section-5-actions-to-avoid"/>
+    <w:bookmarkEnd w:id="15"/>
+    <w:bookmarkStart w:id="16" w:name="correction-5-section-5-actions-to-avoid"/>
     <w:p>
       <w:pPr>
         <w:pStyle w:val="Heading3"/>
@@ -1387,9 +1821,9 @@
         </w:pict>
       </w:r>
     </w:p>
-    <w:bookmarkEnd w:id="14"/>
-    <w:bookmarkEnd w:id="15"/>
-    <w:bookmarkStart w:id="25" w:name="X3c2e12297f9ec44d1af3f37b81e12e861f05a37"/>
+    <w:bookmarkEnd w:id="16"/>
+    <w:bookmarkEnd w:id="17"/>
+    <w:bookmarkStart w:id="27" w:name="X3c2e12297f9ec44d1af3f37b81e12e861f05a37"/>
     <w:p>
       <w:pPr>
         <w:pStyle w:val="Heading2"/>
@@ -1405,7 +1839,7 @@
         </w:pict>
       </w:r>
     </w:p>
-    <w:bookmarkStart w:id="16" w:name="X007878b2caf505490cb0b58134874f8bb7e5e68"/>
+    <w:bookmarkStart w:id="18" w:name="X007878b2caf505490cb0b58134874f8bb7e5e68"/>
     <w:p>
       <w:pPr>
         <w:pStyle w:val="Heading3"/>
@@ -1471,8 +1905,8 @@
         </w:pict>
       </w:r>
     </w:p>
-    <w:bookmarkEnd w:id="16"/>
-    <w:bookmarkStart w:id="17" w:name="Xd261f02b652f68b68d6a9208253836a1796936a"/>
+    <w:bookmarkEnd w:id="18"/>
+    <w:bookmarkStart w:id="19" w:name="Xd261f02b652f68b68d6a9208253836a1796936a"/>
     <w:p>
       <w:pPr>
         <w:pStyle w:val="Heading3"/>
@@ -1638,8 +2072,8 @@
         </w:pict>
       </w:r>
     </w:p>
-    <w:bookmarkEnd w:id="17"/>
-    <w:bookmarkStart w:id="18" w:name="Xb6d25fe0fafa2af7f242e2236feb1cfe07e3402"/>
+    <w:bookmarkEnd w:id="19"/>
+    <w:bookmarkStart w:id="20" w:name="Xb6d25fe0fafa2af7f242e2236feb1cfe07e3402"/>
     <w:p>
       <w:pPr>
         <w:pStyle w:val="Heading3"/>
@@ -1681,7 +2115,7 @@
         <w:pStyle w:val="BlockText"/>
         <w:numPr>
           <w:ilvl w:val="0"/>
-          <w:numId w:val="1001"/>
+          <w:numId w:val="1002"/>
         </w:numPr>
       </w:pPr>
       <w:r>
@@ -1710,7 +2144,7 @@
         <w:pStyle w:val="BlockText"/>
         <w:numPr>
           <w:ilvl w:val="0"/>
-          <w:numId w:val="1001"/>
+          <w:numId w:val="1002"/>
         </w:numPr>
       </w:pPr>
       <w:r>
@@ -1735,7 +2169,7 @@
         <w:pStyle w:val="BlockText"/>
         <w:numPr>
           <w:ilvl w:val="0"/>
-          <w:numId w:val="1001"/>
+          <w:numId w:val="1002"/>
         </w:numPr>
       </w:pPr>
       <w:r>
@@ -1760,7 +2194,7 @@
         <w:pStyle w:val="BlockText"/>
         <w:numPr>
           <w:ilvl w:val="0"/>
-          <w:numId w:val="1001"/>
+          <w:numId w:val="1002"/>
         </w:numPr>
       </w:pPr>
       <w:r>
@@ -1779,7 +2213,7 @@
         <w:pStyle w:val="BlockText"/>
         <w:numPr>
           <w:ilvl w:val="0"/>
-          <w:numId w:val="1001"/>
+          <w:numId w:val="1002"/>
         </w:numPr>
       </w:pPr>
       <w:r>
@@ -1798,7 +2232,7 @@
         <w:pStyle w:val="BlockText"/>
         <w:numPr>
           <w:ilvl w:val="0"/>
-          <w:numId w:val="1001"/>
+          <w:numId w:val="1002"/>
         </w:numPr>
       </w:pPr>
       <w:r>
@@ -1823,7 +2257,7 @@
         <w:pStyle w:val="BlockText"/>
         <w:numPr>
           <w:ilvl w:val="0"/>
-          <w:numId w:val="1001"/>
+          <w:numId w:val="1002"/>
         </w:numPr>
       </w:pPr>
       <w:r>
@@ -1854,7 +2288,7 @@
         <w:pStyle w:val="BlockText"/>
         <w:numPr>
           <w:ilvl w:val="0"/>
-          <w:numId w:val="1001"/>
+          <w:numId w:val="1002"/>
         </w:numPr>
       </w:pPr>
       <w:r>
@@ -1887,8 +2321,8 @@
         </w:pict>
       </w:r>
     </w:p>
-    <w:bookmarkEnd w:id="18"/>
-    <w:bookmarkStart w:id="19" w:name="Xbda23dbbdf2d2861e6db46aa9dad59293da4bd4"/>
+    <w:bookmarkEnd w:id="20"/>
+    <w:bookmarkStart w:id="21" w:name="Xbda23dbbdf2d2861e6db46aa9dad59293da4bd4"/>
     <w:p>
       <w:pPr>
         <w:pStyle w:val="Heading3"/>
@@ -2066,8 +2500,8 @@
         </w:pict>
       </w:r>
     </w:p>
-    <w:bookmarkEnd w:id="19"/>
-    <w:bookmarkStart w:id="20" w:name="Xcb2c56b052e870aea68f9690bde4159d0dad6a4"/>
+    <w:bookmarkEnd w:id="21"/>
+    <w:bookmarkStart w:id="22" w:name="Xcb2c56b052e870aea68f9690bde4159d0dad6a4"/>
     <w:p>
       <w:pPr>
         <w:pStyle w:val="Heading3"/>
@@ -2115,8 +2549,8 @@
         </w:pict>
       </w:r>
     </w:p>
-    <w:bookmarkEnd w:id="20"/>
-    <w:bookmarkStart w:id="21" w:name="X4b63ab77beedb5cd95abfb382f5354e92ef8e72"/>
+    <w:bookmarkEnd w:id="22"/>
+    <w:bookmarkStart w:id="23" w:name="X4b63ab77beedb5cd95abfb382f5354e92ef8e72"/>
     <w:p>
       <w:pPr>
         <w:pStyle w:val="Heading3"/>
@@ -2226,8 +2660,8 @@
         </w:pict>
       </w:r>
     </w:p>
-    <w:bookmarkEnd w:id="21"/>
-    <w:bookmarkStart w:id="22" w:name="Xd381eff1936f4feef346bc8a13279339d4c7b88"/>
+    <w:bookmarkEnd w:id="23"/>
+    <w:bookmarkStart w:id="24" w:name="Xd381eff1936f4feef346bc8a13279339d4c7b88"/>
     <w:p>
       <w:pPr>
         <w:pStyle w:val="Heading3"/>
@@ -2297,8 +2731,8 @@
         </w:pict>
       </w:r>
     </w:p>
-    <w:bookmarkEnd w:id="22"/>
-    <w:bookmarkStart w:id="23" w:name="X8a6f2a14fb3b3d6ec62da529ee584d8707210c2"/>
+    <w:bookmarkEnd w:id="24"/>
+    <w:bookmarkStart w:id="25" w:name="X8a6f2a14fb3b3d6ec62da529ee584d8707210c2"/>
     <w:p>
       <w:pPr>
         <w:pStyle w:val="Heading3"/>
@@ -2352,8 +2786,8 @@
         </w:pict>
       </w:r>
     </w:p>
-    <w:bookmarkEnd w:id="23"/>
-    <w:bookmarkStart w:id="24" w:name="X15e432e6f3c013d4fe19085a07b354303a6881b"/>
+    <w:bookmarkEnd w:id="25"/>
+    <w:bookmarkStart w:id="26" w:name="X15e432e6f3c013d4fe19085a07b354303a6881b"/>
     <w:p>
       <w:pPr>
         <w:pStyle w:val="Heading3"/>
@@ -2407,9 +2841,9 @@
         </w:pict>
       </w:r>
     </w:p>
-    <w:bookmarkEnd w:id="24"/>
-    <w:bookmarkEnd w:id="25"/>
-    <w:bookmarkStart w:id="26" w:name="X23dde0c45e4f67dec472f20c47df2ee7896d841"/>
+    <w:bookmarkEnd w:id="26"/>
+    <w:bookmarkEnd w:id="27"/>
+    <w:bookmarkStart w:id="28" w:name="X23dde0c45e4f67dec472f20c47df2ee7896d841"/>
     <w:p>
       <w:pPr>
         <w:pStyle w:val="Heading2"/>
@@ -2832,8 +3266,8 @@
         </w:pict>
       </w:r>
     </w:p>
-    <w:bookmarkEnd w:id="26"/>
-    <w:bookmarkStart w:id="30" w:name="section-4-summary-of-changes"/>
+    <w:bookmarkEnd w:id="28"/>
+    <w:bookmarkStart w:id="32" w:name="section-4-summary-of-changes"/>
     <w:p>
       <w:pPr>
         <w:pStyle w:val="Heading2"/>
@@ -2842,216 +3276,13 @@
         <w:t xml:space="preserve">SECTION 4 — SUMMARY OF CHANGES</w:t>
       </w:r>
     </w:p>
-    <w:bookmarkStart w:id="27" w:name="Xedda5d550e3145cc1655f7a4b89beaec75329ab"/>
+    <w:bookmarkStart w:id="29" w:name="Xedda5d550e3145cc1655f7a4b89beaec75329ab"/>
     <w:p>
       <w:pPr>
         <w:pStyle w:val="Heading3"/>
       </w:pPr>
       <w:r>
         <w:t xml:space="preserve">High Priority (change before sharing with Solimed)</w:t>
-      </w:r>
-    </w:p>
-    <w:p>
-      <w:pPr>
-        <w:pStyle w:val="Compact"/>
-        <w:numPr>
-          <w:ilvl w:val="0"/>
-          <w:numId w:val="1002"/>
-        </w:numPr>
-      </w:pPr>
-      <w:r>
-        <w:rPr>
-          <w:b/>
-          <w:bCs/>
-        </w:rPr>
-        <w:t xml:space="preserve">CORRECTION 1</w:t>
-      </w:r>
-      <w:r>
-        <w:t xml:space="preserve"> </w:t>
-      </w:r>
-      <w:r>
-        <w:t xml:space="preserve">— Reframe the maturity assessment; remove</w:t>
-      </w:r>
-      <w:r>
-        <w:t xml:space="preserve"> </w:t>
-      </w:r>
-      <w:r>
-        <w:t xml:space="preserve">“lightweight tracking tool”</w:t>
-      </w:r>
-      <w:r>
-        <w:t xml:space="preserve"> </w:t>
-      </w:r>
-      <w:r>
-        <w:t xml:space="preserve">language</w:t>
-      </w:r>
-    </w:p>
-    <w:p>
-      <w:pPr>
-        <w:pStyle w:val="Compact"/>
-        <w:numPr>
-          <w:ilvl w:val="0"/>
-          <w:numId w:val="1002"/>
-        </w:numPr>
-      </w:pPr>
-      <w:r>
-        <w:rPr>
-          <w:b/>
-          <w:bCs/>
-        </w:rPr>
-        <w:t xml:space="preserve">CORRECTION 2</w:t>
-      </w:r>
-      <w:r>
-        <w:t xml:space="preserve"> </w:t>
-      </w:r>
-      <w:r>
-        <w:t xml:space="preserve">— Remove</w:t>
-      </w:r>
-      <w:r>
-        <w:t xml:space="preserve"> </w:t>
-      </w:r>
-      <w:r>
-        <w:t xml:space="preserve">“paper as primary data capture”</w:t>
-      </w:r>
-      <w:r>
-        <w:t xml:space="preserve">; clarify source docs are deliberate</w:t>
-      </w:r>
-    </w:p>
-    <w:p>
-      <w:pPr>
-        <w:pStyle w:val="Compact"/>
-        <w:numPr>
-          <w:ilvl w:val="0"/>
-          <w:numId w:val="1002"/>
-        </w:numPr>
-      </w:pPr>
-      <w:r>
-        <w:rPr>
-          <w:b/>
-          <w:bCs/>
-        </w:rPr>
-        <w:t xml:space="preserve">CORRECTION 3</w:t>
-      </w:r>
-      <w:r>
-        <w:t xml:space="preserve"> </w:t>
-      </w:r>
-      <w:r>
-        <w:t xml:space="preserve">— Remove patient engagement / recruitment layer recommendations</w:t>
-      </w:r>
-    </w:p>
-    <w:p>
-      <w:pPr>
-        <w:pStyle w:val="Compact"/>
-        <w:numPr>
-          <w:ilvl w:val="0"/>
-          <w:numId w:val="1002"/>
-        </w:numPr>
-      </w:pPr>
-      <w:r>
-        <w:rPr>
-          <w:b/>
-          <w:bCs/>
-        </w:rPr>
-        <w:t xml:space="preserve">CORRECTION 4</w:t>
-      </w:r>
-      <w:r>
-        <w:t xml:space="preserve"> </w:t>
-      </w:r>
-      <w:r>
-        <w:t xml:space="preserve">— Reframe EDC from</w:t>
-      </w:r>
-      <w:r>
-        <w:t xml:space="preserve"> </w:t>
-      </w:r>
-      <w:r>
-        <w:t xml:space="preserve">“replace paper”</w:t>
-      </w:r>
-      <w:r>
-        <w:t xml:space="preserve"> </w:t>
-      </w:r>
-      <w:r>
-        <w:t xml:space="preserve">to</w:t>
-      </w:r>
-      <w:r>
-        <w:t xml:space="preserve"> </w:t>
-      </w:r>
-      <w:r>
-        <w:t xml:space="preserve">“integrate with CRO-owned EDC”</w:t>
-      </w:r>
-    </w:p>
-    <w:p>
-      <w:pPr>
-        <w:pStyle w:val="Compact"/>
-        <w:numPr>
-          <w:ilvl w:val="0"/>
-          <w:numId w:val="1002"/>
-        </w:numPr>
-      </w:pPr>
-      <w:r>
-        <w:rPr>
-          <w:b/>
-          <w:bCs/>
-        </w:rPr>
-        <w:t xml:space="preserve">ADDITION 1</w:t>
-      </w:r>
-      <w:r>
-        <w:t xml:space="preserve"> </w:t>
-      </w:r>
-      <w:r>
-        <w:t xml:space="preserve">— Add strategic context for why they built their own</w:t>
-      </w:r>
-    </w:p>
-    <w:p>
-      <w:pPr>
-        <w:pStyle w:val="Compact"/>
-        <w:numPr>
-          <w:ilvl w:val="0"/>
-          <w:numId w:val="1002"/>
-        </w:numPr>
-      </w:pPr>
-      <w:r>
-        <w:rPr>
-          <w:b/>
-          <w:bCs/>
-        </w:rPr>
-        <w:t xml:space="preserve">ADDITION 3</w:t>
-      </w:r>
-      <w:r>
-        <w:t xml:space="preserve"> </w:t>
-      </w:r>
-      <w:r>
-        <w:t xml:space="preserve">— Add all 8 confirmed pain points from the demo</w:t>
-      </w:r>
-    </w:p>
-    <w:p>
-      <w:pPr>
-        <w:pStyle w:val="Compact"/>
-        <w:numPr>
-          <w:ilvl w:val="0"/>
-          <w:numId w:val="1002"/>
-        </w:numPr>
-      </w:pPr>
-      <w:r>
-        <w:rPr>
-          <w:b/>
-          <w:bCs/>
-        </w:rPr>
-        <w:t xml:space="preserve">ADDITION 9</w:t>
-      </w:r>
-      <w:r>
-        <w:t xml:space="preserve"> </w:t>
-      </w:r>
-      <w:r>
-        <w:t xml:space="preserve">— Add Mladen key person risk</w:t>
-      </w:r>
-    </w:p>
-    <w:bookmarkEnd w:id="27"/>
-    <w:bookmarkStart w:id="28" w:name="medium-priority-add-before-final-version"/>
-    <w:p>
-      <w:pPr>
-        <w:pStyle w:val="Heading3"/>
-      </w:pPr>
-      <w:r>
-        <w:t xml:space="preserve">Medium Priority (add before final version)</w:t>
       </w:r>
     </w:p>
     <w:p>
@@ -3067,13 +3298,13 @@
           <w:b/>
           <w:bCs/>
         </w:rPr>
-        <w:t xml:space="preserve">ADDITION 2</w:t>
-      </w:r>
-      <w:r>
-        <w:t xml:space="preserve"> </w:t>
-      </w:r>
-      <w:r>
-        <w:t xml:space="preserve">— Add Power BI as a strength (Section 1.4)</w:t>
+        <w:t xml:space="preserve">SECTION 0 ADDITION</w:t>
+      </w:r>
+      <w:r>
+        <w:t xml:space="preserve"> </w:t>
+      </w:r>
+      <w:r>
+        <w:t xml:space="preserve">— Add the recognition/acknowledgment section as the opening — do this first</w:t>
       </w:r>
     </w:p>
     <w:p>
@@ -3089,13 +3320,25 @@
           <w:b/>
           <w:bCs/>
         </w:rPr>
-        <w:t xml:space="preserve">ADDITION 4</w:t>
-      </w:r>
-      <w:r>
-        <w:t xml:space="preserve"> </w:t>
-      </w:r>
-      <w:r>
-        <w:t xml:space="preserve">— Add investigator fee model complexity</w:t>
+        <w:t xml:space="preserve">CORRECTION 1</w:t>
+      </w:r>
+      <w:r>
+        <w:t xml:space="preserve"> </w:t>
+      </w:r>
+      <w:r>
+        <w:t xml:space="preserve">— Reframe the maturity assessment; remove</w:t>
+      </w:r>
+      <w:r>
+        <w:t xml:space="preserve"> </w:t>
+      </w:r>
+      <w:r>
+        <w:t xml:space="preserve">“lightweight tracking tool”</w:t>
+      </w:r>
+      <w:r>
+        <w:t xml:space="preserve"> </w:t>
+      </w:r>
+      <w:r>
+        <w:t xml:space="preserve">language</w:t>
       </w:r>
     </w:p>
     <w:p>
@@ -3111,25 +3354,22 @@
           <w:b/>
           <w:bCs/>
         </w:rPr>
-        <w:t xml:space="preserve">ADDITION 5</w:t>
-      </w:r>
-      <w:r>
-        <w:t xml:space="preserve"> </w:t>
-      </w:r>
-      <w:r>
-        <w:t xml:space="preserve">— Add amendment</w:t>
-      </w:r>
-      <w:r>
-        <w:t xml:space="preserve"> </w:t>
-      </w:r>
-      <w:r>
-        <w:t xml:space="preserve">“effective from”</w:t>
-      </w:r>
-      <w:r>
-        <w:t xml:space="preserve"> </w:t>
-      </w:r>
-      <w:r>
-        <w:t xml:space="preserve">system as a strength</w:t>
+        <w:t xml:space="preserve">CORRECTION 2</w:t>
+      </w:r>
+      <w:r>
+        <w:t xml:space="preserve"> </w:t>
+      </w:r>
+      <w:r>
+        <w:t xml:space="preserve">— Remove</w:t>
+      </w:r>
+      <w:r>
+        <w:t xml:space="preserve"> </w:t>
+      </w:r>
+      <w:r>
+        <w:t xml:space="preserve">“paper as primary data capture”</w:t>
+      </w:r>
+      <w:r>
+        <w:t xml:space="preserve">; clarify source docs are deliberate</w:t>
       </w:r>
     </w:p>
     <w:p>
@@ -3145,13 +3385,13 @@
           <w:b/>
           <w:bCs/>
         </w:rPr>
-        <w:t xml:space="preserve">ADDITION 6</w:t>
-      </w:r>
-      <w:r>
-        <w:t xml:space="preserve"> </w:t>
-      </w:r>
-      <w:r>
-        <w:t xml:space="preserve">— Add the answer to the strategic question from the transcript</w:t>
+        <w:t xml:space="preserve">CORRECTION 3</w:t>
+      </w:r>
+      <w:r>
+        <w:t xml:space="preserve"> </w:t>
+      </w:r>
+      <w:r>
+        <w:t xml:space="preserve">— Remove patient engagement / recruitment layer recommendations</w:t>
       </w:r>
     </w:p>
     <w:p>
@@ -3167,13 +3407,31 @@
           <w:b/>
           <w:bCs/>
         </w:rPr>
-        <w:t xml:space="preserve">ADDITION 8</w:t>
-      </w:r>
-      <w:r>
-        <w:t xml:space="preserve"> </w:t>
-      </w:r>
-      <w:r>
-        <w:t xml:space="preserve">— Explicitly retain Power BI in target architecture</w:t>
+        <w:t xml:space="preserve">CORRECTION 4</w:t>
+      </w:r>
+      <w:r>
+        <w:t xml:space="preserve"> </w:t>
+      </w:r>
+      <w:r>
+        <w:t xml:space="preserve">— Reframe EDC from</w:t>
+      </w:r>
+      <w:r>
+        <w:t xml:space="preserve"> </w:t>
+      </w:r>
+      <w:r>
+        <w:t xml:space="preserve">“replace paper”</w:t>
+      </w:r>
+      <w:r>
+        <w:t xml:space="preserve"> </w:t>
+      </w:r>
+      <w:r>
+        <w:t xml:space="preserve">to</w:t>
+      </w:r>
+      <w:r>
+        <w:t xml:space="preserve"> </w:t>
+      </w:r>
+      <w:r>
+        <w:t xml:space="preserve">“integrate with CRO-owned EDC”</w:t>
       </w:r>
     </w:p>
     <w:p>
@@ -3189,35 +3447,67 @@
           <w:b/>
           <w:bCs/>
         </w:rPr>
-        <w:t xml:space="preserve">CORRECTION 5</w:t>
-      </w:r>
-      <w:r>
-        <w:t xml:space="preserve"> </w:t>
-      </w:r>
-      <w:r>
-        <w:t xml:space="preserve">— Soften the</w:t>
-      </w:r>
-      <w:r>
-        <w:t xml:space="preserve"> </w:t>
-      </w:r>
-      <w:r>
-        <w:t xml:space="preserve">“don’t extend Power Apps”</w:t>
-      </w:r>
-      <w:r>
-        <w:t xml:space="preserve"> </w:t>
-      </w:r>
-      <w:r>
-        <w:t xml:space="preserve">language</w:t>
-      </w:r>
-    </w:p>
-    <w:bookmarkEnd w:id="28"/>
-    <w:bookmarkStart w:id="29" w:name="lower-priority-add-for-completeness"/>
+        <w:t xml:space="preserve">ADDITION 1</w:t>
+      </w:r>
+      <w:r>
+        <w:t xml:space="preserve"> </w:t>
+      </w:r>
+      <w:r>
+        <w:t xml:space="preserve">— Add strategic context for why they built their own</w:t>
+      </w:r>
+    </w:p>
+    <w:p>
+      <w:pPr>
+        <w:pStyle w:val="Compact"/>
+        <w:numPr>
+          <w:ilvl w:val="0"/>
+          <w:numId w:val="1003"/>
+        </w:numPr>
+      </w:pPr>
+      <w:r>
+        <w:rPr>
+          <w:b/>
+          <w:bCs/>
+        </w:rPr>
+        <w:t xml:space="preserve">ADDITION 3</w:t>
+      </w:r>
+      <w:r>
+        <w:t xml:space="preserve"> </w:t>
+      </w:r>
+      <w:r>
+        <w:t xml:space="preserve">— Add all 8 confirmed pain points from the demo</w:t>
+      </w:r>
+    </w:p>
+    <w:p>
+      <w:pPr>
+        <w:pStyle w:val="Compact"/>
+        <w:numPr>
+          <w:ilvl w:val="0"/>
+          <w:numId w:val="1003"/>
+        </w:numPr>
+      </w:pPr>
+      <w:r>
+        <w:rPr>
+          <w:b/>
+          <w:bCs/>
+        </w:rPr>
+        <w:t xml:space="preserve">ADDITION 9</w:t>
+      </w:r>
+      <w:r>
+        <w:t xml:space="preserve"> </w:t>
+      </w:r>
+      <w:r>
+        <w:t xml:space="preserve">— Add Mladen key person risk</w:t>
+      </w:r>
+    </w:p>
+    <w:bookmarkEnd w:id="29"/>
+    <w:bookmarkStart w:id="30" w:name="medium-priority-add-before-final-version"/>
     <w:p>
       <w:pPr>
         <w:pStyle w:val="Heading3"/>
       </w:pPr>
       <w:r>
-        <w:t xml:space="preserve">Lower Priority (add for completeness)</w:t>
+        <w:t xml:space="preserve">Medium Priority (add before final version)</w:t>
       </w:r>
     </w:p>
     <w:p>
@@ -3233,13 +3523,13 @@
           <w:b/>
           <w:bCs/>
         </w:rPr>
-        <w:t xml:space="preserve">ADDITION 7</w:t>
-      </w:r>
-      <w:r>
-        <w:t xml:space="preserve"> </w:t>
-      </w:r>
-      <w:r>
-        <w:t xml:space="preserve">— Country selection framework / Tier 1 recommendation</w:t>
+        <w:t xml:space="preserve">ADDITION 2</w:t>
+      </w:r>
+      <w:r>
+        <w:t xml:space="preserve"> </w:t>
+      </w:r>
+      <w:r>
+        <w:t xml:space="preserve">— Add Power BI as a strength (Section 1.4)</w:t>
       </w:r>
     </w:p>
     <w:p>
@@ -3251,6 +3541,172 @@
         </w:numPr>
       </w:pPr>
       <w:r>
+        <w:rPr>
+          <w:b/>
+          <w:bCs/>
+        </w:rPr>
+        <w:t xml:space="preserve">ADDITION 4</w:t>
+      </w:r>
+      <w:r>
+        <w:t xml:space="preserve"> </w:t>
+      </w:r>
+      <w:r>
+        <w:t xml:space="preserve">— Add investigator fee model complexity</w:t>
+      </w:r>
+    </w:p>
+    <w:p>
+      <w:pPr>
+        <w:pStyle w:val="Compact"/>
+        <w:numPr>
+          <w:ilvl w:val="0"/>
+          <w:numId w:val="1004"/>
+        </w:numPr>
+      </w:pPr>
+      <w:r>
+        <w:rPr>
+          <w:b/>
+          <w:bCs/>
+        </w:rPr>
+        <w:t xml:space="preserve">ADDITION 5</w:t>
+      </w:r>
+      <w:r>
+        <w:t xml:space="preserve"> </w:t>
+      </w:r>
+      <w:r>
+        <w:t xml:space="preserve">— Add amendment</w:t>
+      </w:r>
+      <w:r>
+        <w:t xml:space="preserve"> </w:t>
+      </w:r>
+      <w:r>
+        <w:t xml:space="preserve">“effective from”</w:t>
+      </w:r>
+      <w:r>
+        <w:t xml:space="preserve"> </w:t>
+      </w:r>
+      <w:r>
+        <w:t xml:space="preserve">system as a strength</w:t>
+      </w:r>
+    </w:p>
+    <w:p>
+      <w:pPr>
+        <w:pStyle w:val="Compact"/>
+        <w:numPr>
+          <w:ilvl w:val="0"/>
+          <w:numId w:val="1004"/>
+        </w:numPr>
+      </w:pPr>
+      <w:r>
+        <w:rPr>
+          <w:b/>
+          <w:bCs/>
+        </w:rPr>
+        <w:t xml:space="preserve">ADDITION 6</w:t>
+      </w:r>
+      <w:r>
+        <w:t xml:space="preserve"> </w:t>
+      </w:r>
+      <w:r>
+        <w:t xml:space="preserve">— Add the answer to the strategic question from the transcript</w:t>
+      </w:r>
+    </w:p>
+    <w:p>
+      <w:pPr>
+        <w:pStyle w:val="Compact"/>
+        <w:numPr>
+          <w:ilvl w:val="0"/>
+          <w:numId w:val="1004"/>
+        </w:numPr>
+      </w:pPr>
+      <w:r>
+        <w:rPr>
+          <w:b/>
+          <w:bCs/>
+        </w:rPr>
+        <w:t xml:space="preserve">ADDITION 8</w:t>
+      </w:r>
+      <w:r>
+        <w:t xml:space="preserve"> </w:t>
+      </w:r>
+      <w:r>
+        <w:t xml:space="preserve">— Explicitly retain Power BI in target architecture</w:t>
+      </w:r>
+    </w:p>
+    <w:p>
+      <w:pPr>
+        <w:pStyle w:val="Compact"/>
+        <w:numPr>
+          <w:ilvl w:val="0"/>
+          <w:numId w:val="1004"/>
+        </w:numPr>
+      </w:pPr>
+      <w:r>
+        <w:rPr>
+          <w:b/>
+          <w:bCs/>
+        </w:rPr>
+        <w:t xml:space="preserve">CORRECTION 5</w:t>
+      </w:r>
+      <w:r>
+        <w:t xml:space="preserve"> </w:t>
+      </w:r>
+      <w:r>
+        <w:t xml:space="preserve">— Soften the</w:t>
+      </w:r>
+      <w:r>
+        <w:t xml:space="preserve"> </w:t>
+      </w:r>
+      <w:r>
+        <w:t xml:space="preserve">“don’t extend Power Apps”</w:t>
+      </w:r>
+      <w:r>
+        <w:t xml:space="preserve"> </w:t>
+      </w:r>
+      <w:r>
+        <w:t xml:space="preserve">language</w:t>
+      </w:r>
+    </w:p>
+    <w:bookmarkEnd w:id="30"/>
+    <w:bookmarkStart w:id="31" w:name="lower-priority-add-for-completeness"/>
+    <w:p>
+      <w:pPr>
+        <w:pStyle w:val="Heading3"/>
+      </w:pPr>
+      <w:r>
+        <w:t xml:space="preserve">Lower Priority (add for completeness)</w:t>
+      </w:r>
+    </w:p>
+    <w:p>
+      <w:pPr>
+        <w:pStyle w:val="Compact"/>
+        <w:numPr>
+          <w:ilvl w:val="0"/>
+          <w:numId w:val="1005"/>
+        </w:numPr>
+      </w:pPr>
+      <w:r>
+        <w:rPr>
+          <w:b/>
+          <w:bCs/>
+        </w:rPr>
+        <w:t xml:space="preserve">ADDITION 7</w:t>
+      </w:r>
+      <w:r>
+        <w:t xml:space="preserve"> </w:t>
+      </w:r>
+      <w:r>
+        <w:t xml:space="preserve">— Country selection framework / Tier 1 recommendation</w:t>
+      </w:r>
+    </w:p>
+    <w:p>
+      <w:pPr>
+        <w:pStyle w:val="Compact"/>
+        <w:numPr>
+          <w:ilvl w:val="0"/>
+          <w:numId w:val="1005"/>
+        </w:numPr>
+      </w:pPr>
+      <w:r>
         <w:t xml:space="preserve">Maturity table correction (Correction 1 sub-table)</w:t>
       </w:r>
     </w:p>
@@ -3273,9 +3729,9 @@
         <w:t xml:space="preserve">Gap analysis based on: Solmed_CTO_Assessment_DRAFT.docx (Eric Garrison, WTE Solutions) vs. Pivot analysis of Jan 23, 2026 demo recording (visual + Whisper transcript).</w:t>
       </w:r>
     </w:p>
-    <w:bookmarkEnd w:id="29"/>
-    <w:bookmarkEnd w:id="30"/>
     <w:bookmarkEnd w:id="31"/>
+    <w:bookmarkEnd w:id="32"/>
+    <w:bookmarkEnd w:id="33"/>
     <w:sectPr>
       <w:footnotePr>
         <w:numRestart w:val="eachSect"/>
@@ -3386,6 +3842,109 @@
       </w:pPr>
     </w:lvl>
   </w:abstractNum>
+  <w:abstractNum w:abstractNumId="991">
+    <w:nsid w:val="0000A991"/>
+    <w:multiLevelType w:val="multilevel"/>
+    <w:lvl w:ilvl="0">
+      <w:numFmt w:val="bullet"/>
+      <w:lvlText w:val=""/>
+      <w:lvlJc w:val="left"/>
+      <w:pPr>
+        <w:ind w:left="720" w:hanging="360"/>
+      </w:pPr>
+      <w:rPr>
+        <w:rFonts w:ascii="Symbol" w:hAnsi="Symbol" w:cs="Symbol" w:hint="default"/>
+      </w:rPr>
+    </w:lvl>
+    <w:lvl w:ilvl="1">
+      <w:numFmt w:val="bullet"/>
+      <w:lvlText w:val="o"/>
+      <w:lvlJc w:val="left"/>
+      <w:pPr>
+        <w:ind w:left="1440" w:hanging="360"/>
+      </w:pPr>
+      <w:rPr>
+        <w:rFonts w:ascii="Courier New" w:hAnsi="Courier New" w:cs="Courier New" w:hint="default"/>
+      </w:rPr>
+    </w:lvl>
+    <w:lvl w:ilvl="2">
+      <w:numFmt w:val="bullet"/>
+      <w:lvlText w:val=""/>
+      <w:lvlJc w:val="left"/>
+      <w:pPr>
+        <w:ind w:left="2160" w:hanging="360"/>
+      </w:pPr>
+      <w:rPr>
+        <w:rFonts w:ascii="Wingdings" w:hAnsi="Wingdings" w:cs="Wingdings" w:hint="default"/>
+      </w:rPr>
+    </w:lvl>
+    <w:lvl w:ilvl="3">
+      <w:numFmt w:val="bullet"/>
+      <w:lvlText w:val=""/>
+      <w:lvlJc w:val="left"/>
+      <w:pPr>
+        <w:ind w:left="2880" w:hanging="360"/>
+      </w:pPr>
+      <w:rPr>
+        <w:rFonts w:ascii="Symbol" w:hAnsi="Symbol" w:cs="Symbol" w:hint="default"/>
+      </w:rPr>
+    </w:lvl>
+    <w:lvl w:ilvl="4">
+      <w:numFmt w:val="bullet"/>
+      <w:lvlText w:val="o"/>
+      <w:lvlJc w:val="left"/>
+      <w:pPr>
+        <w:ind w:left="3600" w:hanging="360"/>
+      </w:pPr>
+      <w:rPr>
+        <w:rFonts w:ascii="Courier New" w:hAnsi="Courier New" w:cs="Courier New" w:hint="default"/>
+      </w:rPr>
+    </w:lvl>
+    <w:lvl w:ilvl="5">
+      <w:numFmt w:val="bullet"/>
+      <w:lvlText w:val=""/>
+      <w:lvlJc w:val="left"/>
+      <w:pPr>
+        <w:ind w:left="4320" w:hanging="360"/>
+      </w:pPr>
+      <w:rPr>
+        <w:rFonts w:ascii="Wingdings" w:hAnsi="Wingdings" w:cs="Wingdings" w:hint="default"/>
+      </w:rPr>
+    </w:lvl>
+    <w:lvl w:ilvl="6">
+      <w:numFmt w:val="bullet"/>
+      <w:lvlText w:val=""/>
+      <w:lvlJc w:val="left"/>
+      <w:pPr>
+        <w:ind w:left="5040" w:hanging="360"/>
+      </w:pPr>
+      <w:rPr>
+        <w:rFonts w:ascii="Symbol" w:hAnsi="Symbol" w:cs="Symbol" w:hint="default"/>
+      </w:rPr>
+    </w:lvl>
+    <w:lvl w:ilvl="7">
+      <w:numFmt w:val="bullet"/>
+      <w:lvlText w:val="o"/>
+      <w:lvlJc w:val="left"/>
+      <w:pPr>
+        <w:ind w:left="5760" w:hanging="360"/>
+      </w:pPr>
+      <w:rPr>
+        <w:rFonts w:ascii="Courier New" w:hAnsi="Courier New" w:cs="Courier New" w:hint="default"/>
+      </w:rPr>
+    </w:lvl>
+    <w:lvl w:ilvl="8">
+      <w:numFmt w:val="bullet"/>
+      <w:lvlText w:val=""/>
+      <w:lvlJc w:val="left"/>
+      <w:pPr>
+        <w:ind w:left="6480" w:hanging="360"/>
+      </w:pPr>
+      <w:rPr>
+        <w:rFonts w:ascii="Wingdings" w:hAnsi="Wingdings" w:cs="Wingdings" w:hint="default"/>
+      </w:rPr>
+    </w:lvl>
+  </w:abstractNum>
   <w:abstractNum w:abstractNumId="99411">
     <w:nsid w:val="00A99411"/>
     <w:multiLevelType w:val="multilevel"/>
@@ -3463,6 +4022,91 @@
     </w:lvl>
     <w:lvl w:ilvl="8">
       <w:start w:val="1"/>
+      <w:numFmt w:val="decimal"/>
+      <w:lvlText w:val="%9."/>
+      <w:lvlJc w:val="left"/>
+      <w:pPr>
+        <w:ind w:left="6480" w:hanging="360"/>
+      </w:pPr>
+    </w:lvl>
+  </w:abstractNum>
+  <w:abstractNum w:abstractNumId="99410">
+    <w:nsid w:val="00A99410"/>
+    <w:multiLevelType w:val="multilevel"/>
+    <w:lvl w:ilvl="0">
+      <w:start w:val="0"/>
+      <w:numFmt w:val="decimal"/>
+      <w:lvlText w:val="%1."/>
+      <w:lvlJc w:val="left"/>
+      <w:pPr>
+        <w:ind w:left="720" w:hanging="360"/>
+      </w:pPr>
+    </w:lvl>
+    <w:lvl w:ilvl="1">
+      <w:start w:val="0"/>
+      <w:numFmt w:val="decimal"/>
+      <w:lvlText w:val="%2."/>
+      <w:lvlJc w:val="left"/>
+      <w:pPr>
+        <w:ind w:left="1440" w:hanging="360"/>
+      </w:pPr>
+    </w:lvl>
+    <w:lvl w:ilvl="2">
+      <w:start w:val="0"/>
+      <w:numFmt w:val="decimal"/>
+      <w:lvlText w:val="%3."/>
+      <w:lvlJc w:val="left"/>
+      <w:pPr>
+        <w:ind w:left="2160" w:hanging="360"/>
+      </w:pPr>
+    </w:lvl>
+    <w:lvl w:ilvl="3">
+      <w:start w:val="0"/>
+      <w:numFmt w:val="decimal"/>
+      <w:lvlText w:val="%4."/>
+      <w:lvlJc w:val="left"/>
+      <w:pPr>
+        <w:ind w:left="2880" w:hanging="360"/>
+      </w:pPr>
+    </w:lvl>
+    <w:lvl w:ilvl="4">
+      <w:start w:val="0"/>
+      <w:numFmt w:val="decimal"/>
+      <w:lvlText w:val="%5."/>
+      <w:lvlJc w:val="left"/>
+      <w:pPr>
+        <w:ind w:left="3600" w:hanging="360"/>
+      </w:pPr>
+    </w:lvl>
+    <w:lvl w:ilvl="5">
+      <w:start w:val="0"/>
+      <w:numFmt w:val="decimal"/>
+      <w:lvlText w:val="%6."/>
+      <w:lvlJc w:val="left"/>
+      <w:pPr>
+        <w:ind w:left="4320" w:hanging="360"/>
+      </w:pPr>
+    </w:lvl>
+    <w:lvl w:ilvl="6">
+      <w:start w:val="0"/>
+      <w:numFmt w:val="decimal"/>
+      <w:lvlText w:val="%7."/>
+      <w:lvlJc w:val="left"/>
+      <w:pPr>
+        <w:ind w:left="5040" w:hanging="360"/>
+      </w:pPr>
+    </w:lvl>
+    <w:lvl w:ilvl="7">
+      <w:start w:val="0"/>
+      <w:numFmt w:val="decimal"/>
+      <w:lvlText w:val="%8."/>
+      <w:lvlJc w:val="left"/>
+      <w:pPr>
+        <w:ind w:left="5760" w:hanging="360"/>
+      </w:pPr>
+    </w:lvl>
+    <w:lvl w:ilvl="8">
+      <w:start w:val="0"/>
       <w:numFmt w:val="decimal"/>
       <w:lvlText w:val="%9."/>
       <w:lvlJc w:val="left"/>
@@ -3645,34 +4289,7 @@
     <w:abstractNumId w:val="990"/>
   </w:num>
   <w:num w:numId="1001">
-    <w:abstractNumId w:val="99411"/>
-    <w:lvlOverride w:ilvl="0">
-      <w:startOverride w:val="1"/>
-    </w:lvlOverride>
-    <w:lvlOverride w:ilvl="1">
-      <w:startOverride w:val="1"/>
-    </w:lvlOverride>
-    <w:lvlOverride w:ilvl="2">
-      <w:startOverride w:val="1"/>
-    </w:lvlOverride>
-    <w:lvlOverride w:ilvl="3">
-      <w:startOverride w:val="1"/>
-    </w:lvlOverride>
-    <w:lvlOverride w:ilvl="4">
-      <w:startOverride w:val="1"/>
-    </w:lvlOverride>
-    <w:lvlOverride w:ilvl="5">
-      <w:startOverride w:val="1"/>
-    </w:lvlOverride>
-    <w:lvlOverride w:ilvl="6">
-      <w:startOverride w:val="1"/>
-    </w:lvlOverride>
-    <w:lvlOverride w:ilvl="7">
-      <w:startOverride w:val="1"/>
-    </w:lvlOverride>
-    <w:lvlOverride w:ilvl="8">
-      <w:startOverride w:val="1"/>
-    </w:lvlOverride>
+    <w:abstractNumId w:val="991"/>
   </w:num>
   <w:num w:numId="1002">
     <w:abstractNumId w:val="99411"/>
@@ -3705,6 +4322,36 @@
     </w:lvlOverride>
   </w:num>
   <w:num w:numId="1003">
+    <w:abstractNumId w:val="99410"/>
+    <w:lvlOverride w:ilvl="0">
+      <w:startOverride w:val="0"/>
+    </w:lvlOverride>
+    <w:lvlOverride w:ilvl="1">
+      <w:startOverride w:val="0"/>
+    </w:lvlOverride>
+    <w:lvlOverride w:ilvl="2">
+      <w:startOverride w:val="0"/>
+    </w:lvlOverride>
+    <w:lvlOverride w:ilvl="3">
+      <w:startOverride w:val="0"/>
+    </w:lvlOverride>
+    <w:lvlOverride w:ilvl="4">
+      <w:startOverride w:val="0"/>
+    </w:lvlOverride>
+    <w:lvlOverride w:ilvl="5">
+      <w:startOverride w:val="0"/>
+    </w:lvlOverride>
+    <w:lvlOverride w:ilvl="6">
+      <w:startOverride w:val="0"/>
+    </w:lvlOverride>
+    <w:lvlOverride w:ilvl="7">
+      <w:startOverride w:val="0"/>
+    </w:lvlOverride>
+    <w:lvlOverride w:ilvl="8">
+      <w:startOverride w:val="0"/>
+    </w:lvlOverride>
+  </w:num>
+  <w:num w:numId="1004">
     <w:abstractNumId w:val="99418"/>
     <w:lvlOverride w:ilvl="0">
       <w:startOverride w:val="8"/>
@@ -3734,7 +4381,7 @@
       <w:startOverride w:val="8"/>
     </w:lvlOverride>
   </w:num>
-  <w:num w:numId="1004">
+  <w:num w:numId="1005">
     <w:abstractNumId w:val="994114"/>
     <w:lvlOverride w:ilvl="0">
       <w:startOverride w:val="14"/>

</xml_diff>